<commit_message>
made changes in srs
</commit_message>
<xml_diff>
--- a/srs.docx
+++ b/srs.docx
@@ -71,6 +71,20 @@
                               <w:t>Buttons</w:t>
                             </w:r>
                           </w:p>
+                          <w:p>
+                            <w:pPr>
+                              <w:jc w:val="center"/>
+                              <w:rPr>
+                                <w:color w:val="000000" w:themeColor="text1"/>
+                              </w:rPr>
+                            </w:pPr>
+                            <w:r>
+                              <w:rPr>
+                                <w:color w:val="000000" w:themeColor="text1"/>
+                              </w:rPr>
+                              <w:t>#FFE565</w:t>
+                            </w:r>
+                          </w:p>
                         </w:txbxContent>
                       </wps:txbx>
                       <wps:bodyPr rot="0" spcFirstLastPara="0" vertOverflow="overflow" horzOverflow="overflow" vert="horz" wrap="square" lIns="91440" tIns="45720" rIns="91440" bIns="45720" numCol="1" spcCol="0" rtlCol="0" fromWordArt="0" anchor="ctr" anchorCtr="0" forceAA="0" compatLnSpc="1">
@@ -105,6 +119,20 @@
                           <w:color w:val="000000" w:themeColor="text1"/>
                         </w:rPr>
                         <w:t>Buttons</w:t>
+                      </w:r>
+                    </w:p>
+                    <w:p>
+                      <w:pPr>
+                        <w:jc w:val="center"/>
+                        <w:rPr>
+                          <w:color w:val="000000" w:themeColor="text1"/>
+                        </w:rPr>
+                      </w:pPr>
+                      <w:r>
+                        <w:rPr>
+                          <w:color w:val="000000" w:themeColor="text1"/>
+                        </w:rPr>
+                        <w:t>#FFE565</w:t>
                       </w:r>
                     </w:p>
                   </w:txbxContent>
@@ -176,6 +204,14 @@
                               <w:t>Tabs</w:t>
                             </w:r>
                           </w:p>
+                          <w:p>
+                            <w:pPr>
+                              <w:jc w:val="center"/>
+                            </w:pPr>
+                            <w:r>
+                              <w:t>#2E2E2E</w:t>
+                            </w:r>
+                          </w:p>
                         </w:txbxContent>
                       </wps:txbx>
                       <wps:bodyPr rot="0" spcFirstLastPara="0" vertOverflow="overflow" horzOverflow="overflow" vert="horz" wrap="square" lIns="91440" tIns="45720" rIns="91440" bIns="45720" numCol="1" spcCol="0" rtlCol="0" fromWordArt="0" anchor="ctr" anchorCtr="0" forceAA="0" compatLnSpc="1">
@@ -204,6 +240,14 @@
                       </w:pPr>
                       <w:r>
                         <w:t>Tabs</w:t>
+                      </w:r>
+                    </w:p>
+                    <w:p>
+                      <w:pPr>
+                        <w:jc w:val="center"/>
+                      </w:pPr>
+                      <w:r>
+                        <w:t>#2E2E2E</w:t>
                       </w:r>
                     </w:p>
                   </w:txbxContent>
@@ -282,6 +326,21 @@
                               <w:t>Background 1</w:t>
                             </w:r>
                           </w:p>
+                          <w:p>
+                            <w:pPr>
+                              <w:rPr>
+                                <w:sz w:val="22"/>
+                                <w:szCs w:val="22"/>
+                              </w:rPr>
+                            </w:pPr>
+                            <w:r>
+                              <w:rPr>
+                                <w:sz w:val="22"/>
+                                <w:szCs w:val="22"/>
+                              </w:rPr>
+                              <w:t>#4E71FF</w:t>
+                            </w:r>
+                          </w:p>
                         </w:txbxContent>
                       </wps:txbx>
                       <wps:bodyPr rot="0" spcFirstLastPara="0" vertOverflow="overflow" horzOverflow="overflow" vert="horz" wrap="square" lIns="91440" tIns="45720" rIns="91440" bIns="45720" numCol="1" spcCol="0" rtlCol="0" fromWordArt="0" anchor="ctr" anchorCtr="0" forceAA="0" compatLnSpc="1">
@@ -314,6 +373,21 @@
                           <w:szCs w:val="22"/>
                         </w:rPr>
                         <w:t>Background 1</w:t>
+                      </w:r>
+                    </w:p>
+                    <w:p>
+                      <w:pPr>
+                        <w:rPr>
+                          <w:sz w:val="22"/>
+                          <w:szCs w:val="22"/>
+                        </w:rPr>
+                      </w:pPr>
+                      <w:r>
+                        <w:rPr>
+                          <w:sz w:val="22"/>
+                          <w:szCs w:val="22"/>
+                        </w:rPr>
+                        <w:t>#4E71FF</w:t>
                       </w:r>
                     </w:p>
                   </w:txbxContent>
@@ -394,6 +468,23 @@
                               <w:t>Background 2</w:t>
                             </w:r>
                           </w:p>
+                          <w:p>
+                            <w:pPr>
+                              <w:rPr>
+                                <w:color w:val="000000" w:themeColor="text1"/>
+                                <w:sz w:val="22"/>
+                                <w:szCs w:val="22"/>
+                              </w:rPr>
+                            </w:pPr>
+                            <w:r>
+                              <w:rPr>
+                                <w:color w:val="000000" w:themeColor="text1"/>
+                                <w:sz w:val="22"/>
+                                <w:szCs w:val="22"/>
+                              </w:rPr>
+                              <w:t>#8DD8FF</w:t>
+                            </w:r>
+                          </w:p>
                         </w:txbxContent>
                       </wps:txbx>
                       <wps:bodyPr rot="0" spcFirstLastPara="0" vertOverflow="overflow" horzOverflow="overflow" vert="horz" wrap="square" lIns="91440" tIns="45720" rIns="91440" bIns="45720" numCol="1" spcCol="0" rtlCol="0" fromWordArt="0" anchor="ctr" anchorCtr="0" forceAA="0" compatLnSpc="1">
@@ -431,6 +522,23 @@
                           <w:szCs w:val="22"/>
                         </w:rPr>
                         <w:t>Background 2</w:t>
+                      </w:r>
+                    </w:p>
+                    <w:p>
+                      <w:pPr>
+                        <w:rPr>
+                          <w:color w:val="000000" w:themeColor="text1"/>
+                          <w:sz w:val="22"/>
+                          <w:szCs w:val="22"/>
+                        </w:rPr>
+                      </w:pPr>
+                      <w:r>
+                        <w:rPr>
+                          <w:color w:val="000000" w:themeColor="text1"/>
+                          <w:sz w:val="22"/>
+                          <w:szCs w:val="22"/>
+                        </w:rPr>
+                        <w:t>#8DD8FF</w:t>
                       </w:r>
                     </w:p>
                   </w:txbxContent>

</xml_diff>